<commit_message>
Rework study plan to follow lab manual methods and formulas
Co-Authored-By: Claude Opus 5.5 <noreply@anthropic.com>
Claude-Session: https://claude.ai/code/session_01KGYA5o8w68Xqno6PxLDqtE
</commit_message>
<xml_diff>
--- a/Podgotovka_himanaliz_BR.docx
+++ b/Podgotovka_himanaliz_BR.docx
@@ -4,7 +4,7 @@
   <w:body>
     <w:p>
       <w:r>
-        <w:t>body{font-family:'Times New Roman';font-size:12pt}table{border-collapse:collapse}td,th{border:1px solid #000;padding:3px 6px}h1{font-size:16pt}h2{font-size:14pt} Подготовка к защите: химический анализ фильтрата бурового раствора</w:t>
+        <w:t>body{font-family:'Times New Roman';font-size:12pt;margin:20px}table{border-collapse:collapse;margin:6px 0}td,th{border:1px solid #000;padding:3px 6px}h1{font-size:16pt}h2{font-size:14pt}.w{background:#fff3cd} Лабораторная работа № 2. Химический анализ фильтрата бурового раствора — подготовка к защите</w:t>
       </w:r>
     </w:p>
     <w:p>
@@ -17,7 +17,7 @@
         <w:rPr>
           <w:i/>
         </w:rPr>
-        <w:t>Методика по API RP 13B. Нормальности растворов и коэффициенты сверить с методичкой.</w:t>
+        <w:t>Составлено по методичке ЛР № 2.</w:t>
       </w:r>
     </w:p>
     <w:p>
@@ -25,63 +25,58 @@
         <w:pStyle w:val="Heading2"/>
       </w:pPr>
       <w:r>
-        <w:t>1. Щёлочность: Pf, Mf, Pm</w:t>
+        <w:t>0. Общий принцип (спросят первым)</w:t>
       </w:r>
     </w:p>
     <w:p>
-      <w:pPr>
-        <w:pStyle w:val="ListBullet"/>
-      </w:pPr>
+      <w:r>
+        <w:t xml:space="preserve">Химический анализ фильтрата — это </w:t>
+      </w:r>
       <w:r>
         <w:rPr>
           <w:b/>
         </w:rPr>
-        <w:t>Pf</w:t>
+        <w:t>титрование</w:t>
       </w:r>
       <w:r>
-        <w:t xml:space="preserve"> — титрование фильтрата 0,02 н H₂SO₄ до обесцвечивания фенолфталеина (pH 8,3). Показывает OH⁻ и половину CO₃²⁻.</w:t>
+        <w:t xml:space="preserve">. К известному объёму пробы V₂ добавляют стандартный раствор известной нормальности n₁ до конца титрования. Конец титрования определяют по смене цвета </w:t>
       </w:r>
-    </w:p>
-    <w:p>
-      <w:pPr>
-        <w:pStyle w:val="ListBullet"/>
-      </w:pPr>
       <w:r>
         <w:rPr>
           <w:b/>
         </w:rPr>
-        <w:t>Mf</w:t>
+        <w:t>индикатора</w:t>
       </w:r>
       <w:r>
-        <w:t xml:space="preserve"> — тот же образец титруют дальше до метилоранжа (pH ≈ 4,3). Показывает общую щёлочность, включая HCO₃⁻. Считается общим объёмом кислоты от начала титрования.</w:t>
+        <w:t>.</w:t>
       </w:r>
     </w:p>
     <w:p>
-      <w:pPr>
-        <w:pStyle w:val="ListBullet"/>
-      </w:pPr>
+      <w:r>
+        <w:t>Основная формула: n₁·V₁ = n₂·V₂, откуда n₂ = n₁·V₁/V₂.</w:t>
+      </w:r>
+    </w:p>
+    <w:p>
+      <w:r>
+        <w:t xml:space="preserve">Все расчётные формулы методички имеют один вид: </w:t>
+      </w:r>
       <w:r>
         <w:rPr>
           <w:b/>
         </w:rPr>
-        <w:t>Pm</w:t>
+        <w:t>X (мг-экв/л) = V·N·1000 / a</w:t>
       </w:r>
       <w:r>
-        <w:t xml:space="preserve"> — то же, что Pf, но по самому раствору. Учитывает нерастворённую известь и цемент. Избыток извести = 0,26·(Pm − Fw·Pf) фунт/барр, где Fw — доля воды.</w:t>
+        <w:t xml:space="preserve">, </w:t>
       </w:r>
-    </w:p>
-    <w:p>
-      <w:pPr>
-        <w:pStyle w:val="ListBullet"/>
-      </w:pPr>
       <w:r>
         <w:rPr>
           <w:b/>
         </w:rPr>
-        <w:t>Зачем отдельно Pf и Mf.</w:t>
+        <w:t>Y (мг/л) = X·Э</w:t>
       </w:r>
       <w:r>
-        <w:t xml:space="preserve"> Метилоранж показывает только суммарную щёлочность и не отличает гидроксиды от карбонатов и бикарбонатов. Pf выделяет то, что выше pH 8,3 (OH⁻, CO₃²⁻). Сравнение Pf и Mf раскладывает щёлочность по ионам.</w:t>
+        <w:t>. Здесь a — объём пробы в мл, Э — эквивалент иона: Cl⁻ = 35,5, Ca²⁺ = 40.</w:t>
       </w:r>
     </w:p>
     <w:tbl>
@@ -102,7 +97,7 @@
           </w:tcPr>
           <w:p>
             <w:r>
-              <w:t>Условие</w:t>
+              <w:t>Показатель</w:t>
             </w:r>
           </w:p>
         </w:tc>
@@ -112,7 +107,7 @@
           </w:tcPr>
           <w:p>
             <w:r>
-              <w:t>OH⁻</w:t>
+              <w:t>Титрант</w:t>
             </w:r>
           </w:p>
         </w:tc>
@@ -122,7 +117,7 @@
           </w:tcPr>
           <w:p>
             <w:r>
-              <w:t>CO₃²⁻</w:t>
+              <w:t>Индикатор</w:t>
             </w:r>
           </w:p>
         </w:tc>
@@ -132,7 +127,422 @@
           </w:tcPr>
           <w:p>
             <w:r>
-              <w:t>HCO₃⁻</w:t>
+              <w:t>Переход окраски</w:t>
+            </w:r>
+          </w:p>
+        </w:tc>
+      </w:tr>
+      <w:tr>
+        <w:tc>
+          <w:tcPr>
+            <w:tcW w:type="dxa" w:w="0"/>
+          </w:tcPr>
+          <w:p>
+            <w:r>
+              <w:t>Pf, Pm</w:t>
+            </w:r>
+          </w:p>
+        </w:tc>
+        <w:tc>
+          <w:tcPr>
+            <w:tcW w:type="dxa" w:w="0"/>
+          </w:tcPr>
+          <w:p>
+            <w:r>
+              <w:t>0,02 н H₂SO₄ (HNO₃)</w:t>
+            </w:r>
+          </w:p>
+        </w:tc>
+        <w:tc>
+          <w:tcPr>
+            <w:tcW w:type="dxa" w:w="0"/>
+          </w:tcPr>
+          <w:p>
+            <w:r>
+              <w:t>фенолфталеин</w:t>
+            </w:r>
+          </w:p>
+        </w:tc>
+        <w:tc>
+          <w:tcPr>
+            <w:tcW w:type="dxa" w:w="0"/>
+          </w:tcPr>
+          <w:p>
+            <w:r>
+              <w:t>розовый → бесцветный (pH 8,3)</w:t>
+            </w:r>
+          </w:p>
+        </w:tc>
+      </w:tr>
+      <w:tr>
+        <w:tc>
+          <w:tcPr>
+            <w:tcW w:type="dxa" w:w="0"/>
+          </w:tcPr>
+          <w:p>
+            <w:r>
+              <w:t>Mf</w:t>
+            </w:r>
+          </w:p>
+        </w:tc>
+        <w:tc>
+          <w:tcPr>
+            <w:tcW w:type="dxa" w:w="0"/>
+          </w:tcPr>
+          <w:p>
+            <w:r>
+              <w:t>0,02 н H₂SO₄</w:t>
+            </w:r>
+          </w:p>
+        </w:tc>
+        <w:tc>
+          <w:tcPr>
+            <w:tcW w:type="dxa" w:w="0"/>
+          </w:tcPr>
+          <w:p>
+            <w:r>
+              <w:t>метилоранж (или бромкрезоловый зелёный)</w:t>
+            </w:r>
+          </w:p>
+        </w:tc>
+        <w:tc>
+          <w:tcPr>
+            <w:tcW w:type="dxa" w:w="0"/>
+          </w:tcPr>
+          <w:p>
+            <w:r>
+              <w:t>жёлтый → розовый (pH 4,3)</w:t>
+            </w:r>
+          </w:p>
+        </w:tc>
+      </w:tr>
+      <w:tr>
+        <w:tc>
+          <w:tcPr>
+            <w:tcW w:type="dxa" w:w="0"/>
+          </w:tcPr>
+          <w:p>
+            <w:r>
+              <w:t>Cl⁻</w:t>
+            </w:r>
+          </w:p>
+        </w:tc>
+        <w:tc>
+          <w:tcPr>
+            <w:tcW w:type="dxa" w:w="0"/>
+          </w:tcPr>
+          <w:p>
+            <w:r>
+              <w:t>AgNO₃ 0,0282 н</w:t>
+            </w:r>
+          </w:p>
+        </w:tc>
+        <w:tc>
+          <w:tcPr>
+            <w:tcW w:type="dxa" w:w="0"/>
+          </w:tcPr>
+          <w:p>
+            <w:r>
+              <w:t>хромат калия K₂CrO₄</w:t>
+            </w:r>
+          </w:p>
+        </w:tc>
+        <w:tc>
+          <w:tcPr>
+            <w:tcW w:type="dxa" w:w="0"/>
+          </w:tcPr>
+          <w:p>
+            <w:r>
+              <w:t>жёлтый → красно-бурый</w:t>
+            </w:r>
+          </w:p>
+        </w:tc>
+      </w:tr>
+      <w:tr>
+        <w:tc>
+          <w:tcPr>
+            <w:tcW w:type="dxa" w:w="0"/>
+          </w:tcPr>
+          <w:p>
+            <w:r>
+              <w:t>Общая жёсткость</w:t>
+            </w:r>
+          </w:p>
+        </w:tc>
+        <w:tc>
+          <w:tcPr>
+            <w:tcW w:type="dxa" w:w="0"/>
+          </w:tcPr>
+          <w:p>
+            <w:r>
+              <w:t>Трилон Б (ЭДТА) 0,01 М</w:t>
+            </w:r>
+          </w:p>
+        </w:tc>
+        <w:tc>
+          <w:tcPr>
+            <w:tcW w:type="dxa" w:w="0"/>
+          </w:tcPr>
+          <w:p>
+            <w:r>
+              <w:t>эриохром чёрный Т (кальмагит), буфер pH 10</w:t>
+            </w:r>
+          </w:p>
+        </w:tc>
+        <w:tc>
+          <w:tcPr>
+            <w:tcW w:type="dxa" w:w="0"/>
+          </w:tcPr>
+          <w:p>
+            <w:r>
+              <w:t>винно-красный → голубой</w:t>
+            </w:r>
+          </w:p>
+        </w:tc>
+      </w:tr>
+      <w:tr>
+        <w:tc>
+          <w:tcPr>
+            <w:tcW w:type="dxa" w:w="0"/>
+          </w:tcPr>
+          <w:p>
+            <w:r>
+              <w:t>Ca²⁺</w:t>
+            </w:r>
+          </w:p>
+        </w:tc>
+        <w:tc>
+          <w:tcPr>
+            <w:tcW w:type="dxa" w:w="0"/>
+          </w:tcPr>
+          <w:p>
+            <w:r>
+              <w:t>Трилон Б 0,01 М</w:t>
+            </w:r>
+          </w:p>
+        </w:tc>
+        <w:tc>
+          <w:tcPr>
+            <w:tcW w:type="dxa" w:w="0"/>
+          </w:tcPr>
+          <w:p>
+            <w:r>
+              <w:t>мурексид (калкон), NaOH до pH 12–13</w:t>
+            </w:r>
+          </w:p>
+        </w:tc>
+        <w:tc>
+          <w:tcPr>
+            <w:tcW w:type="dxa" w:w="0"/>
+          </w:tcPr>
+          <w:p>
+            <w:r>
+              <w:t>красный → фиолетовый</w:t>
+            </w:r>
+          </w:p>
+        </w:tc>
+      </w:tr>
+      <w:tr>
+        <w:tc>
+          <w:tcPr>
+            <w:tcW w:type="dxa" w:w="0"/>
+          </w:tcPr>
+          <w:p>
+            <w:r>
+              <w:t>Mg²⁺</w:t>
+            </w:r>
+          </w:p>
+        </w:tc>
+        <w:tc>
+          <w:tcPr>
+            <w:tcW w:type="dxa" w:w="0"/>
+          </w:tcPr>
+          <w:p>
+            <w:r>
+              <w:t>расчётом: Y</w:t>
+            </w:r>
+            <w:r>
+              <w:rPr>
+                <w:vertAlign w:val="subscript"/>
+              </w:rPr>
+              <w:t>Mg</w:t>
+            </w:r>
+            <w:r>
+              <w:t xml:space="preserve"> = 0,6·(Ж − Ca), где 0,6 = 24,3/40</w:t>
+            </w:r>
+          </w:p>
+        </w:tc>
+        <w:tc>
+          <w:tcPr>
+            <w:tcW w:type="dxa" w:w="0"/>
+          </w:tcPr>
+          <w:p/>
+        </w:tc>
+        <w:tc>
+          <w:tcPr>
+            <w:tcW w:type="dxa" w:w="0"/>
+          </w:tcPr>
+          <w:p/>
+        </w:tc>
+      </w:tr>
+    </w:tbl>
+    <w:p>
+      <w:r>
+        <w:t xml:space="preserve"> </w:t>
+      </w:r>
+    </w:p>
+    <w:p>
+      <w:r>
+        <w:t xml:space="preserve"> </w:t>
+      </w:r>
+    </w:p>
+    <w:p>
+      <w:r>
+        <w:t xml:space="preserve"> </w:t>
+      </w:r>
+    </w:p>
+    <w:p>
+      <w:r>
+        <w:t xml:space="preserve"> </w:t>
+      </w:r>
+    </w:p>
+    <w:p>
+      <w:r>
+        <w:t xml:space="preserve"> </w:t>
+      </w:r>
+    </w:p>
+    <w:p>
+      <w:r>
+        <w:t xml:space="preserve"> </w:t>
+      </w:r>
+    </w:p>
+    <w:p>
+      <w:r>
+        <w:t xml:space="preserve"> 1. Щёлочность: Pf, Mf, Pm</w:t>
+      </w:r>
+    </w:p>
+    <w:p>
+      <w:pPr>
+        <w:pStyle w:val="Heading2"/>
+      </w:pPr>
+    </w:p>
+    <w:p>
+      <w:pPr>
+        <w:pStyle w:val="ListBullet"/>
+      </w:pPr>
+      <w:r>
+        <w:rPr>
+          <w:b/>
+        </w:rPr>
+        <w:t>Pf</w:t>
+      </w:r>
+      <w:r>
+        <w:t xml:space="preserve"> — сколько мл 0,02 н кислоты ушло на 1 мл фильтрата до обесцвечивания фенолфталеина (pH 8,3).</w:t>
+      </w:r>
+    </w:p>
+    <w:p>
+      <w:pPr>
+        <w:pStyle w:val="ListBullet"/>
+      </w:pPr>
+      <w:r>
+        <w:rPr>
+          <w:b/>
+        </w:rPr>
+        <w:t>Mf</w:t>
+      </w:r>
+      <w:r>
+        <w:t xml:space="preserve"> — к тому же образцу добавляют метилоранж и титруют дальше до перехода жёлтого в розовый (pH 4,3). Mf — это </w:t>
+      </w:r>
+      <w:r>
+        <w:rPr>
+          <w:b/>
+        </w:rPr>
+        <w:t>общий</w:t>
+      </w:r>
+      <w:r>
+        <w:t xml:space="preserve"> объём кислоты, включая объём, ушедший на Pf.</w:t>
+      </w:r>
+    </w:p>
+    <w:p>
+      <w:pPr>
+        <w:pStyle w:val="ListBullet"/>
+      </w:pPr>
+      <w:r>
+        <w:rPr>
+          <w:b/>
+        </w:rPr>
+        <w:t>Pm</w:t>
+      </w:r>
+      <w:r>
+        <w:t xml:space="preserve"> — то же, что Pf, но для 1 мл самого бурового раствора, разбавленного 25–50 мл воды. Учитывает нерастворённую известь.</w:t>
+      </w:r>
+    </w:p>
+    <w:p>
+      <w:pPr>
+        <w:pStyle w:val="ListBullet"/>
+      </w:pPr>
+      <w:r>
+        <w:t>Если образец тёмный и смену цвета не видно, конечную точку определяют pH-метром: 8,3 для Pf и Pm, 4,3 для Mf.</w:t>
+      </w:r>
+    </w:p>
+    <w:p>
+      <w:r>
+        <w:rPr>
+          <w:b/>
+        </w:rPr>
+        <w:t>Зачем отдельно Pf и Mf.</w:t>
+      </w:r>
+      <w:r>
+        <w:t xml:space="preserve"> Метилоранж даёт только суммарную щёлочность и не показывает, чем она создана. Фенолфталеин реагирует только на то, что выше pH 8,3: OH⁻ и CO₃²⁻, превращающийся в HCO₃⁻. Сравнение Pf и Mf показывает </w:t>
+      </w:r>
+      <w:r>
+        <w:rPr>
+          <w:b/>
+        </w:rPr>
+        <w:t>тип щёлочности</w:t>
+      </w:r>
+      <w:r>
+        <w:t>.</w:t>
+      </w:r>
+    </w:p>
+    <w:tbl>
+      <w:tblPr>
+        <w:tblW w:type="auto" w:w="0"/>
+        <w:tblLook w:firstColumn="1" w:firstRow="1" w:lastColumn="0" w:lastRow="0" w:noHBand="0" w:noVBand="1" w:val="04A0"/>
+      </w:tblPr>
+      <w:tblGrid>
+        <w:gridCol w:w="2880"/>
+        <w:gridCol w:w="2880"/>
+        <w:gridCol w:w="2880"/>
+      </w:tblGrid>
+      <w:tr>
+        <w:tc>
+          <w:tcPr>
+            <w:tcW w:type="dxa" w:w="0"/>
+          </w:tcPr>
+          <w:p>
+            <w:r>
+              <w:t>Соотношение</w:t>
+            </w:r>
+          </w:p>
+        </w:tc>
+        <w:tc>
+          <w:tcPr>
+            <w:tcW w:type="dxa" w:w="0"/>
+          </w:tcPr>
+          <w:p>
+            <w:r>
+              <w:t>Чем обусловлена щёлочность</w:t>
+            </w:r>
+          </w:p>
+        </w:tc>
+        <w:tc>
+          <w:tcPr>
+            <w:tcW w:type="dxa" w:w="0"/>
+          </w:tcPr>
+          <w:p>
+            <w:r>
+              <w:t>Состояние раствора</w:t>
             </w:r>
           </w:p>
         </w:tc>
@@ -154,7 +564,7 @@
           </w:tcPr>
           <w:p>
             <w:r>
-              <w:t>0</w:t>
+              <w:t>только HCO₃⁻</w:t>
             </w:r>
           </w:p>
         </w:tc>
@@ -164,17 +574,7 @@
           </w:tcPr>
           <w:p>
             <w:r>
-              <w:t>0</w:t>
-            </w:r>
-          </w:p>
-        </w:tc>
-        <w:tc>
-          <w:tcPr>
-            <w:tcW w:type="dxa" w:w="0"/>
-          </w:tcPr>
-          <w:p>
-            <w:r>
-              <w:t>1220·Mf</w:t>
+              <w:t>нестабилен, трудно контролировать</w:t>
             </w:r>
           </w:p>
         </w:tc>
@@ -196,7 +596,7 @@
           </w:tcPr>
           <w:p>
             <w:r>
-              <w:t>0</w:t>
+              <w:t>CO₃²⁻ + HCO₃⁻</w:t>
             </w:r>
           </w:p>
         </w:tc>
@@ -206,17 +606,7 @@
           </w:tcPr>
           <w:p>
             <w:r>
-              <w:t>1200·Pf</w:t>
-            </w:r>
-          </w:p>
-        </w:tc>
-        <w:tc>
-          <w:tcPr>
-            <w:tcW w:type="dxa" w:w="0"/>
-          </w:tcPr>
-          <w:p>
-            <w:r>
-              <w:t>1220·(Mf−2Pf)</w:t>
+              <w:t>нестабилен, трудно контролировать</w:t>
             </w:r>
           </w:p>
         </w:tc>
@@ -238,7 +628,7 @@
           </w:tcPr>
           <w:p>
             <w:r>
-              <w:t>0</w:t>
+              <w:t>только CO₃²⁻</w:t>
             </w:r>
           </w:p>
         </w:tc>
@@ -248,17 +638,7 @@
           </w:tcPr>
           <w:p>
             <w:r>
-              <w:t>1200·Pf</w:t>
-            </w:r>
-          </w:p>
-        </w:tc>
-        <w:tc>
-          <w:tcPr>
-            <w:tcW w:type="dxa" w:w="0"/>
-          </w:tcPr>
-          <w:p>
-            <w:r>
-              <w:t>0</w:t>
+              <w:t>нестабилен, трудно контролировать</w:t>
             </w:r>
           </w:p>
         </w:tc>
@@ -280,7 +660,7 @@
           </w:tcPr>
           <w:p>
             <w:r>
-              <w:t>340·(2Pf−Mf)</w:t>
+              <w:t>OH⁻ + CO₃²⁻</w:t>
             </w:r>
           </w:p>
         </w:tc>
@@ -290,17 +670,7 @@
           </w:tcPr>
           <w:p>
             <w:r>
-              <w:t>1200·(Mf−Pf)</w:t>
-            </w:r>
-          </w:p>
-        </w:tc>
-        <w:tc>
-          <w:tcPr>
-            <w:tcW w:type="dxa" w:w="0"/>
-          </w:tcPr>
-          <w:p>
-            <w:r>
-              <w:t>0</w:t>
+              <w:t>стабилен, в хорошем состоянии</w:t>
             </w:r>
           </w:p>
         </w:tc>
@@ -322,7 +692,7 @@
           </w:tcPr>
           <w:p>
             <w:r>
-              <w:t>340·Pf</w:t>
+              <w:t>только OH⁻</w:t>
             </w:r>
           </w:p>
         </w:tc>
@@ -332,17 +702,7 @@
           </w:tcPr>
           <w:p>
             <w:r>
-              <w:t>0</w:t>
-            </w:r>
-          </w:p>
-        </w:tc>
-        <w:tc>
-          <w:tcPr>
-            <w:tcW w:type="dxa" w:w="0"/>
-          </w:tcPr>
-          <w:p>
-            <w:r>
-              <w:t>0</w:t>
+              <w:t>стабилен, в хорошем состоянии</w:t>
             </w:r>
           </w:p>
         </w:tc>
@@ -384,7 +744,76 @@
         <w:t>Зачем щёлочность буровикам.</w:t>
       </w:r>
       <w:r>
-        <w:t xml:space="preserve"> По ней видно состояние и загрязнённость раствора:</w:t>
+        <w:t xml:space="preserve"> Раствор с карбонатной и бикарбонатной щёлочностью даёт высокие СНС и вязкость и неустойчивую водоотдачу, которую не исправить обычными добавками. Поэтому бикарбонатную щёлочность переводят в карбонатную, а карбонатную удаляют (осаждают CaCO₃) или переводят в гидроксидную. Для этого используют известь Ca(OH)₂ или каустическую соду NaOH.</w:t>
+      </w:r>
+    </w:p>
+    <w:p>
+      <w:r>
+        <w:t>Бикарбонат не может существовать рядом с гидроксидом: он переходит в карбонат.</w:t>
+      </w:r>
+    </w:p>
+    <w:p>
+      <w:r>
+        <w:t>Реакции обработки:</w:t>
+      </w:r>
+    </w:p>
+    <w:p>
+      <w:pPr>
+        <w:pStyle w:val="ListNumber"/>
+      </w:pPr>
+      <w:r>
+        <w:t>Ca(HCO₃)₂ + Ca(OH)₂ = 2CaCO₃↓ + 2H₂O — если кальция меньше или равно бикарбонату.</w:t>
+      </w:r>
+    </w:p>
+    <w:p>
+      <w:pPr>
+        <w:pStyle w:val="ListNumber"/>
+      </w:pPr>
+      <w:r>
+        <w:t>Ca(HCO₃)₂ + 2NaOH = CaCO₃↓ + Na₂CO₃ + 2H₂O — если кальция больше, чем бикарбоната.</w:t>
+      </w:r>
+    </w:p>
+    <w:p>
+      <w:pPr>
+        <w:pStyle w:val="ListNumber"/>
+      </w:pPr>
+      <w:r>
+        <w:t>NaHCO₃ + Ca(OH)₂ = CaCO₃↓ + NaOH + H₂O — если кальция нет.</w:t>
+      </w:r>
+    </w:p>
+    <w:p>
+      <w:pPr>
+        <w:pStyle w:val="ListNumber"/>
+      </w:pPr>
+      <w:r>
+        <w:t>NaHCO₃ + NaOH = Na₂CO₃ + H₂O</w:t>
+      </w:r>
+    </w:p>
+    <w:p>
+      <w:pPr>
+        <w:pStyle w:val="ListNumber"/>
+      </w:pPr>
+      <w:r>
+        <w:t>Na₂CO₃ + Ca(OH)₂ = CaCO₃↓ + 2NaOH</w:t>
+      </w:r>
+    </w:p>
+    <w:p>
+      <w:r>
+        <w:rPr>
+          <w:b/>
+        </w:rPr>
+        <w:t>Содержание извести:</w:t>
+      </w:r>
+      <w:r>
+        <w:t xml:space="preserve"> 0,742·(Pm − Fw·Pf) кг/м³, или 0,26·(Pm − Fw·Pf) фунт/барр. Fw — объёмная доля воды (% воды / 100).</w:t>
+      </w:r>
+    </w:p>
+    <w:p>
+      <w:r>
+        <w:rPr>
+          <w:i/>
+        </w:rPr>
+        <w:t>В методичке нет формул для перевода в мг/л. Если спросят, это формулы API:</w:t>
       </w:r>
     </w:p>
     <w:p>
@@ -392,7 +821,7 @@
         <w:pStyle w:val="ListBullet"/>
       </w:pPr>
       <w:r>
-        <w:t>рост Mf при низком Pf означает карбонатно-бикарбонатное загрязнение (CO₂ из пласта, термодеструкция лигносульфонатов или лигнитов). Раствор загустевает, реология ухудшается, водоотдача растёт;</w:t>
+        <w:t>2Pf &lt; Mf: CO₃²⁻ = 1200·Pf, HCO₃⁻ = 1220·(Mf − 2Pf);</w:t>
       </w:r>
     </w:p>
     <w:p>
@@ -400,12 +829,7 @@
         <w:pStyle w:val="ListBullet"/>
       </w:pPr>
       <w:r>
-        <w:t>высокий Pf означает загрязнение цементом.</w:t>
-      </w:r>
-    </w:p>
-    <w:p>
-      <w:r>
-        <w:t>Также по щёлочности дозируют известь и каустик, контролируют ингибирование и коррозию.</w:t>
+        <w:t>2Pf &gt; Mf: OH⁻ = 340·(2Pf − Mf), CO₃²⁻ = 1200·(Mf − Pf).</w:t>
       </w:r>
     </w:p>
     <w:p>
@@ -413,7 +837,7 @@
         <w:pStyle w:val="Heading2"/>
       </w:pPr>
       <w:r>
-        <w:t>2. Хлорид-ионы</w:t>
+        <w:t>2. Хлор-ионы</w:t>
       </w:r>
     </w:p>
     <w:p>
@@ -421,15 +845,66 @@
         <w:rPr>
           <w:b/>
         </w:rPr>
-        <w:t>Принцип — метод Мора.</w:t>
+        <w:t>Принцип (аргентометрия, метод Мора).</w:t>
       </w:r>
       <w:r>
-        <w:t xml:space="preserve"> Фильтрат сначала нейтрализуют H₂SO₄ до исчезновения окраски фенолфталеина, иначе в щелочной среде Ag⁺ выпадет в осадок как Ag₂O. Затем добавляют индикатор K₂CrO₄ и титруют AgNO₃. Сначала выпадает белый AgCl. Когда Cl⁻ израсходован, выпадает кирпично-красный Ag₂CrO₄ — это конец титрования.</w:t>
+        <w:t xml:space="preserve"> Ионы Ag⁺ связывают Cl⁻ в белый осадок: Ag⁺ + Cl⁻ → AgCl↓. Когда хлориды практически закончились, лишний Ag⁺ реагирует с индикатором: 2Ag⁺ + CrO₄²⁻ → Ag₂CrO₄↓. Выпадает красно-бурый осадок, это и есть конец титрования.</w:t>
       </w:r>
     </w:p>
     <w:p>
       <w:r>
-        <w:t>Расчёт: Cl⁻ (мг/л) = 1000·V(AgNO₃ 0,0282 н) / V фильтрата. Для 0,282 н раствора множитель 10 000. NaCl = Cl⁻ × 1,65.</w:t>
+        <w:rPr>
+          <w:b/>
+        </w:rPr>
+        <w:t>Порядок:</w:t>
+      </w:r>
+    </w:p>
+    <w:p>
+      <w:pPr>
+        <w:pStyle w:val="ListNumber"/>
+      </w:pPr>
+      <w:r>
+        <w:t>Взять 1–10 мл фильтрата и добавить 25–50 мл дистиллированной воды.</w:t>
+      </w:r>
+    </w:p>
+    <w:p>
+      <w:pPr>
+        <w:pStyle w:val="ListNumber"/>
+      </w:pPr>
+      <w:r>
+        <w:rPr>
+          <w:b/>
+        </w:rPr>
+        <w:t>Оттитровать щёлочность кислотой.</w:t>
+      </w:r>
+      <w:r>
+        <w:t xml:space="preserve"> В щелочной среде Ag⁺ выпадет в осадок гидроксидом или оксидом серебра и завысит расход. Можно брать ту же пробу, в которой уже определяли Mf.</w:t>
+      </w:r>
+    </w:p>
+    <w:p>
+      <w:pPr>
+        <w:pStyle w:val="ListNumber"/>
+      </w:pPr>
+      <w:r>
+        <w:t>Добавить 5–10 капель 5 % K₂CrO₄.</w:t>
+      </w:r>
+    </w:p>
+    <w:p>
+      <w:pPr>
+        <w:pStyle w:val="ListNumber"/>
+      </w:pPr>
+      <w:r>
+        <w:t>Титровать AgNO₃ 0,0282 н. Удобство этого раствора: 1 мл соответствует 1 мг Cl⁻.</w:t>
+      </w:r>
+    </w:p>
+    <w:p>
+      <w:r>
+        <w:t>Расчёт: X = V·N·1000/a (мг-экв/л), Y = X·35,5 (мг/л).</w:t>
+      </w:r>
+    </w:p>
+    <w:p>
+      <w:r>
+        <w:t>Второй метод — меркуриметрический: Hg(NO₃)₂ образует с Cl⁻ малодиссоциирующий HgCl₂, индикатор дифенилкарбазон, переход в сине-фиолетовый.</w:t>
       </w:r>
     </w:p>
     <w:p>
@@ -440,7 +915,7 @@
         <w:t>Зачем определяют.</w:t>
       </w:r>
       <w:r>
-        <w:t xml:space="preserve"> Хлориды показывают, что в раствор попала соль: разбуриваются соленосные отложения или идёт приток пластовой рассолы. Соль флокулирует глину, из-за чего растёт водоотдача и нарушается реология. Кроме того, хлориды нужны для контроля соленасыщенных растворов и оценки коррозии.</w:t>
+        <w:t xml:space="preserve"> По хлоридам видно, попала ли в раствор соль: разбуриваются соленосные породы или идёт приток пластовой минерализованной воды. Соль флокулирует глину, растут вязкость и водоотдача, раствор разрушается. Хлориды также контролируют в минерализованных и соленасыщенных растворах и учитывают при оценке коррозии.</w:t>
       </w:r>
     </w:p>
     <w:p>
@@ -448,12 +923,7 @@
         <w:pStyle w:val="Heading2"/>
       </w:pPr>
       <w:r>
-        <w:t>3. Жёсткость, Ca²⁺, Mg²⁺</w:t>
-      </w:r>
-    </w:p>
-    <w:p>
-      <w:r>
-        <w:t>Определяются трилонометрией (ЭДТА):</w:t>
+        <w:t>3. Жёсткость, кальций, магний</w:t>
       </w:r>
     </w:p>
     <w:p>
@@ -461,7 +931,40 @@
         <w:pStyle w:val="ListBullet"/>
       </w:pPr>
       <w:r>
-        <w:t>общая жёсткость — при pH 10 с эриохромом чёрным;</w:t>
+        <w:rPr>
+          <w:b/>
+        </w:rPr>
+        <w:t>Общая жёсткость</w:t>
+      </w:r>
+      <w:r>
+        <w:t xml:space="preserve"> — суммарное содержание Ca²⁺ и Mg²⁺. Единица: 1 мг-экв/л. Определяется титрованием Трилоном Б с буфером (pH 10) и эриохромом чёрным Т до перехода винно-красного в голубой. </w:t>
+      </w:r>
+      <w:r>
+        <w:rPr>
+          <w:b/>
+        </w:rPr>
+        <w:t>Результат в мг/л выражается «в пересчёте на кальций»</w:t>
+      </w:r>
+      <w:r>
+        <w:t>: Ж</w:t>
+      </w:r>
+      <w:r>
+        <w:rPr>
+          <w:vertAlign w:val="subscript"/>
+        </w:rPr>
+        <w:t>Y</w:t>
+      </w:r>
+      <w:r>
+        <w:t xml:space="preserve"> = Ж</w:t>
+      </w:r>
+      <w:r>
+        <w:rPr>
+          <w:vertAlign w:val="subscript"/>
+        </w:rPr>
+        <w:t>X</w:t>
+      </w:r>
+      <w:r>
+        <w:t>·40. Также 1 мл 0,01 М ЭДТА = 400 мг/л Ca²⁺ при пробе 1 мл.</w:t>
       </w:r>
     </w:p>
     <w:p>
@@ -469,7 +972,13 @@
         <w:pStyle w:val="ListBullet"/>
       </w:pPr>
       <w:r>
-        <w:t>Ca²⁺ — при pH 12–13 с мурексидом, Mg при этом осаждается как Mg(OH)₂;</w:t>
+        <w:rPr>
+          <w:b/>
+        </w:rPr>
+        <w:t>Ca²⁺</w:t>
+      </w:r>
+      <w:r>
+        <w:t xml:space="preserve"> — добавляют NaOH или KOH до pH 12–13, чтобы магний выпал в осадок и не мешал. Индикатор мурексид, титруют до устойчивой фиолетовой окраски.</w:t>
       </w:r>
     </w:p>
     <w:p>
@@ -477,12 +986,27 @@
         <w:pStyle w:val="ListBullet"/>
       </w:pPr>
       <w:r>
-        <w:t>Mg²⁺ — по разности.</w:t>
+        <w:rPr>
+          <w:b/>
+        </w:rPr>
+        <w:t>Mg²⁺</w:t>
+      </w:r>
+      <w:r>
+        <w:t xml:space="preserve"> = 0,6·(Ж − Ca). Коэффициент 0,6 = 24,3/40 переводит «магний в пересчёте на кальций» в настоящий магний.</w:t>
       </w:r>
     </w:p>
     <w:p>
+      <w:pPr>
+        <w:pStyle w:val="ListBullet"/>
+      </w:pPr>
       <w:r>
-        <w:t>Источники Ca²⁺: гипс, ангидрит, цемент. Ca²⁺ флокулирует бентонит и снижает эффективность полимеров. Обработка: кальцинированная сода Na₂CO₃, при загрязнении цементом — бикарбонат натрия.</w:t>
+        <w:rPr>
+          <w:b/>
+        </w:rPr>
+        <w:t>Зачем.</w:t>
+      </w:r>
+      <w:r>
+        <w:t xml:space="preserve"> Ca²⁺ и Mg²⁺ поступают из гипса, ангидрита, цемента и пластовых вод. Они флокулируют глину и снижают эффективность реагентов. Кальций удаляют кальцинированной содой (осаждается CaCO₃).</w:t>
       </w:r>
     </w:p>
     <w:p>
@@ -490,7 +1014,7 @@
         <w:pStyle w:val="Heading2"/>
       </w:pPr>
       <w:r>
-        <w:t>4. Результаты бригад</w:t>
+        <w:t>4. Результаты бригад и выводы</w:t>
       </w:r>
     </w:p>
     <w:tbl>
@@ -525,7 +1049,7 @@
           </w:tcPr>
           <w:p>
             <w:r>
-              <w:t>Pf</w:t>
+              <w:t>Pf, мл</w:t>
             </w:r>
           </w:p>
         </w:tc>
@@ -535,7 +1059,7 @@
           </w:tcPr>
           <w:p>
             <w:r>
-              <w:t>Mf</w:t>
+              <w:t>Mf, мл</w:t>
             </w:r>
           </w:p>
         </w:tc>
@@ -545,7 +1069,7 @@
           </w:tcPr>
           <w:p>
             <w:r>
-              <w:t>Pm</w:t>
+              <w:t>Pm, мл</w:t>
             </w:r>
           </w:p>
         </w:tc>
@@ -575,7 +1099,7 @@
           </w:tcPr>
           <w:p>
             <w:r>
-              <w:t>Ca²⁺</w:t>
+              <w:t>Ca²⁺, мг/л</w:t>
             </w:r>
           </w:p>
         </w:tc>
@@ -585,7 +1109,7 @@
           </w:tcPr>
           <w:p>
             <w:r>
-              <w:t>Mg²⁺</w:t>
+              <w:t>Mg²⁺, мг/л</w:t>
             </w:r>
           </w:p>
         </w:tc>
@@ -941,7 +1465,30 @@
     </w:p>
     <w:p>
       <w:r>
-        <w:t xml:space="preserve"> Расчёт ионного состава (у всех бригад случай 2Pf &lt; Mf):</w:t>
+        <w:t xml:space="preserve"> </w:t>
+      </w:r>
+      <w:r>
+        <w:rPr>
+          <w:b/>
+        </w:rPr>
+        <w:t>Тип щёлочности.</w:t>
+      </w:r>
+      <w:r>
+        <w:t xml:space="preserve"> У всех бригад 2Pf &lt; Mf: 0,30 &lt; 0,77; 1,6 &lt; 1,8; 0,48 &lt; 0,94; 0,9 &lt; 1,8. Щёлочность обусловлена </w:t>
+      </w:r>
+      <w:r>
+        <w:rPr>
+          <w:b/>
+        </w:rPr>
+        <w:t>карбонатами и бикарбонатами</w:t>
+      </w:r>
+      <w:r>
+        <w:t>, OH⁻ нет. По методичке такой раствор нестабилен и трудно регулируется. Рекомендация: обработать известью или каустиком, чтобы перевести HCO₃⁻ в CO₃²⁻ и осадить CaCO₃.</w:t>
+      </w:r>
+    </w:p>
+    <w:p>
+      <w:r>
+        <w:t>Оценка по формулам API:</w:t>
       </w:r>
     </w:p>
     <w:tbl>
@@ -973,16 +1520,6 @@
           </w:tcPr>
           <w:p>
             <w:r>
-              <w:t>OH⁻</w:t>
-            </w:r>
-          </w:p>
-        </w:tc>
-        <w:tc>
-          <w:tcPr>
-            <w:tcW w:type="dxa" w:w="0"/>
-          </w:tcPr>
-          <w:p>
-            <w:r>
               <w:t>CO₃²⁻, мг/л</w:t>
             </w:r>
           </w:p>
@@ -1003,7 +1540,17 @@
           </w:tcPr>
           <w:p>
             <w:r>
-              <w:t>NaCl, г/л</w:t>
+              <w:t>Cl⁻, мг-экв/л</w:t>
+            </w:r>
+          </w:p>
+        </w:tc>
+        <w:tc>
+          <w:tcPr>
+            <w:tcW w:type="dxa" w:w="0"/>
+          </w:tcPr>
+          <w:p>
+            <w:r>
+              <w:t>NaCl, г/л (Cl⁻×1,65)</w:t>
             </w:r>
           </w:p>
         </w:tc>
@@ -1025,16 +1572,6 @@
           </w:tcPr>
           <w:p>
             <w:r>
-              <w:t>0</w:t>
-            </w:r>
-          </w:p>
-        </w:tc>
-        <w:tc>
-          <w:tcPr>
-            <w:tcW w:type="dxa" w:w="0"/>
-          </w:tcPr>
-          <w:p>
-            <w:r>
               <w:t>180</w:t>
             </w:r>
           </w:p>
@@ -1046,6 +1583,16 @@
           <w:p>
             <w:r>
               <w:t>573</w:t>
+            </w:r>
+          </w:p>
+        </w:tc>
+        <w:tc>
+          <w:tcPr>
+            <w:tcW w:type="dxa" w:w="0"/>
+          </w:tcPr>
+          <w:p>
+            <w:r>
+              <w:t>2521</w:t>
             </w:r>
           </w:p>
         </w:tc>
@@ -1077,16 +1624,6 @@
           </w:tcPr>
           <w:p>
             <w:r>
-              <w:t>0</w:t>
-            </w:r>
-          </w:p>
-        </w:tc>
-        <w:tc>
-          <w:tcPr>
-            <w:tcW w:type="dxa" w:w="0"/>
-          </w:tcPr>
-          <w:p>
-            <w:r>
               <w:t>960</w:t>
             </w:r>
           </w:p>
@@ -1098,6 +1635,16 @@
           <w:p>
             <w:r>
               <w:t>244</w:t>
+            </w:r>
+          </w:p>
+        </w:tc>
+        <w:tc>
+          <w:tcPr>
+            <w:tcW w:type="dxa" w:w="0"/>
+          </w:tcPr>
+          <w:p>
+            <w:r>
+              <w:t>2425</w:t>
             </w:r>
           </w:p>
         </w:tc>
@@ -1129,16 +1676,6 @@
           </w:tcPr>
           <w:p>
             <w:r>
-              <w:t>0</w:t>
-            </w:r>
-          </w:p>
-        </w:tc>
-        <w:tc>
-          <w:tcPr>
-            <w:tcW w:type="dxa" w:w="0"/>
-          </w:tcPr>
-          <w:p>
-            <w:r>
               <w:t>288</w:t>
             </w:r>
           </w:p>
@@ -1150,6 +1687,16 @@
           <w:p>
             <w:r>
               <w:t>561</w:t>
+            </w:r>
+          </w:p>
+        </w:tc>
+        <w:tc>
+          <w:tcPr>
+            <w:tcW w:type="dxa" w:w="0"/>
+          </w:tcPr>
+          <w:p>
+            <w:r>
+              <w:t>1218</w:t>
             </w:r>
           </w:p>
         </w:tc>
@@ -1181,16 +1728,6 @@
           </w:tcPr>
           <w:p>
             <w:r>
-              <w:t>0</w:t>
-            </w:r>
-          </w:p>
-        </w:tc>
-        <w:tc>
-          <w:tcPr>
-            <w:tcW w:type="dxa" w:w="0"/>
-          </w:tcPr>
-          <w:p>
-            <w:r>
               <w:t>540</w:t>
             </w:r>
           </w:p>
@@ -1202,6 +1739,16 @@
           <w:p>
             <w:r>
               <w:t>1098</w:t>
+            </w:r>
+          </w:p>
+        </w:tc>
+        <w:tc>
+          <w:tcPr>
+            <w:tcW w:type="dxa" w:w="0"/>
+          </w:tcPr>
+          <w:p>
+            <w:r>
+              <w:t>1290</w:t>
             </w:r>
           </w:p>
         </w:tc>
@@ -1239,71 +1786,295 @@
     </w:p>
     <w:p>
       <w:r>
-        <w:t xml:space="preserve"> Пример для бригады 1: 2Pf = 0,30 &lt; Mf = 0,77, значит OH⁻ = 0. CO₃²⁻ = 1200·0,15 = 180 мг/л. HCO₃⁻ = 1220·(0,77 − 0,30) ≈ 573 мг/л.</w:t>
+        <w:t xml:space="preserve"> Бригада 2 ближе всех к карбонатной щёлочности (2Pf почти равно Mf). У бригад 1, 3, 4 преобладает бикарбонат, хуже всего у бригады 4.</w:t>
       </w:r>
     </w:p>
     <w:p>
-      <w:pPr>
-        <w:pStyle w:val="Heading3"/>
-      </w:pPr>
       <w:r>
-        <w:t>Выводы</w:t>
+        <w:rPr>
+          <w:b/>
+        </w:rPr>
+        <w:t>Хлориды.</w:t>
+      </w:r>
+      <w:r>
+        <w:t xml:space="preserve"> Бригады 1–2: около 86–89 г/л Cl⁻, сильно минерализованный раствор. Бригады 3–4: около 43–46 г/л, примерно вдвое меньше. Насыщение NaCl наступает около 190 г/л Cl⁻, поэтому ни один раствор не насыщен.</w:t>
       </w:r>
     </w:p>
     <w:p>
-      <w:pPr>
-        <w:pStyle w:val="ListBullet"/>
-      </w:pPr>
       <w:r>
-        <w:t>Свободных гидроксидов нет ни у одной бригады. Щёлочность карбонатно-бикарбонатная, раствор загрязнён карбонатами. Больше всего HCO₃⁻ у бригады 4, больше всего CO₃²⁻ у бригады 2. Обработка — известь.</w:t>
+        <w:rPr>
+          <w:b/>
+        </w:rPr>
+        <w:t>Известь.</w:t>
+      </w:r>
+      <w:r>
+        <w:t xml:space="preserve"> Pm &gt; Pf у всех бригад, то есть в растворе есть нерастворённая известь. Больше всего у бригады 2 (Pm = 1,68). Fw не измеряли. Если принять Fw ≈ 0,9, получится: бригада 2 — 0,742·(1,68 − 0,72) ≈ 0,71 кг/м³, бригада 4 — около 0,07 кг/м³.</w:t>
       </w:r>
     </w:p>
     <w:p>
-      <w:pPr>
-        <w:pStyle w:val="ListBullet"/>
-      </w:pPr>
       <w:r>
-        <w:t>У бригад 1–2 хлоридов около 86–89 тыс. мг/л, это высокая минерализация. У бригад 3–4 примерно вдвое меньше. Насыщение NaCl наступает около 190 тыс. мг/л Cl⁻, поэтому ни один раствор не насыщен.</w:t>
+        <w:rPr>
+          <w:b/>
+        </w:rPr>
+        <w:t>Жёсткость и магний: проверка по формуле Mg = 0,6·(Ж − Ca).</w:t>
+      </w:r>
+    </w:p>
+    <w:tbl>
+      <w:tblPr>
+        <w:tblW w:type="auto" w:w="0"/>
+        <w:tblLook w:firstColumn="1" w:firstRow="1" w:lastColumn="0" w:lastRow="0" w:noHBand="0" w:noVBand="1" w:val="04A0"/>
+      </w:tblPr>
+      <w:tblGrid>
+        <w:gridCol w:w="2160"/>
+        <w:gridCol w:w="2160"/>
+        <w:gridCol w:w="2160"/>
+        <w:gridCol w:w="2160"/>
+      </w:tblGrid>
+      <w:tr>
+        <w:tc>
+          <w:tcPr>
+            <w:tcW w:type="dxa" w:w="0"/>
+          </w:tcPr>
+          <w:p>
+            <w:r>
+              <w:t>Бр.</w:t>
+            </w:r>
+          </w:p>
+        </w:tc>
+        <w:tc>
+          <w:tcPr>
+            <w:tcW w:type="dxa" w:w="0"/>
+          </w:tcPr>
+          <w:p>
+            <w:r>
+              <w:t>Расчёт</w:t>
+            </w:r>
+          </w:p>
+        </w:tc>
+        <w:tc>
+          <w:tcPr>
+            <w:tcW w:type="dxa" w:w="0"/>
+          </w:tcPr>
+          <w:p>
+            <w:r>
+              <w:t>Записано</w:t>
+            </w:r>
+          </w:p>
+        </w:tc>
+        <w:tc>
+          <w:tcPr>
+            <w:tcW w:type="dxa" w:w="0"/>
+          </w:tcPr>
+          <w:p>
+            <w:r>
+              <w:t>Вывод</w:t>
+            </w:r>
+          </w:p>
+        </w:tc>
+      </w:tr>
+      <w:tr>
+        <w:tc>
+          <w:tcPr>
+            <w:tcW w:type="dxa" w:w="0"/>
+          </w:tcPr>
+          <w:p>
+            <w:r>
+              <w:t>1</w:t>
+            </w:r>
+          </w:p>
+        </w:tc>
+        <w:tc>
+          <w:tcPr>
+            <w:tcW w:type="dxa" w:w="0"/>
+          </w:tcPr>
+          <w:p>
+            <w:r>
+              <w:t>0,6·(614 − 600) = 8,4</w:t>
+            </w:r>
+          </w:p>
+        </w:tc>
+        <w:tc>
+          <w:tcPr>
+            <w:tcW w:type="dxa" w:w="0"/>
+          </w:tcPr>
+          <w:p>
+            <w:r>
+              <w:t>8,4</w:t>
+            </w:r>
+          </w:p>
+        </w:tc>
+        <w:tc>
+          <w:tcPr>
+            <w:tcW w:type="dxa" w:w="0"/>
+          </w:tcPr>
+          <w:p>
+            <w:r>
+              <w:t>сходится</w:t>
+            </w:r>
+          </w:p>
+        </w:tc>
+      </w:tr>
+      <w:tr>
+        <w:tc>
+          <w:tcPr>
+            <w:tcW w:type="dxa" w:w="0"/>
+          </w:tcPr>
+          <w:p>
+            <w:r>
+              <w:t>2</w:t>
+            </w:r>
+          </w:p>
+        </w:tc>
+        <w:tc>
+          <w:tcPr>
+            <w:tcW w:type="dxa" w:w="0"/>
+          </w:tcPr>
+          <w:p>
+            <w:r>
+              <w:t>0,6·(160 − 160) = 0</w:t>
+            </w:r>
+          </w:p>
+        </w:tc>
+        <w:tc>
+          <w:tcPr>
+            <w:tcW w:type="dxa" w:w="0"/>
+          </w:tcPr>
+          <w:p>
+            <w:r>
+              <w:t>12</w:t>
+            </w:r>
+          </w:p>
+        </w:tc>
+        <w:tc>
+          <w:tcPr>
+            <w:tcW w:type="dxa" w:w="0"/>
+          </w:tcPr>
+          <w:p>
+            <w:r>
+              <w:t>не сходится: Mg определён отдельно или ошибка при записи</w:t>
+            </w:r>
+          </w:p>
+        </w:tc>
+      </w:tr>
+      <w:tr>
+        <w:tc>
+          <w:tcPr>
+            <w:tcW w:type="dxa" w:w="0"/>
+          </w:tcPr>
+          <w:p>
+            <w:r>
+              <w:t>3</w:t>
+            </w:r>
+          </w:p>
+        </w:tc>
+        <w:tc>
+          <w:tcPr>
+            <w:tcW w:type="dxa" w:w="0"/>
+          </w:tcPr>
+          <w:p>
+            <w:r>
+              <w:t>Ж = 208 &lt; Ca = 220</w:t>
+            </w:r>
+          </w:p>
+        </w:tc>
+        <w:tc>
+          <w:tcPr>
+            <w:tcW w:type="dxa" w:w="0"/>
+          </w:tcPr>
+          <w:p>
+            <w:r>
+              <w:t>19</w:t>
+            </w:r>
+          </w:p>
+        </w:tc>
+        <w:tc>
+          <w:tcPr>
+            <w:tcW w:type="dxa" w:w="0"/>
+          </w:tcPr>
+          <w:p>
+            <w:r>
+              <w:t>Ca не может быть больше общей жёсткости, это погрешность</w:t>
+            </w:r>
+          </w:p>
+        </w:tc>
+      </w:tr>
+      <w:tr>
+        <w:tc>
+          <w:tcPr>
+            <w:tcW w:type="dxa" w:w="0"/>
+          </w:tcPr>
+          <w:p>
+            <w:r>
+              <w:t>4</w:t>
+            </w:r>
+          </w:p>
+        </w:tc>
+        <w:tc>
+          <w:tcPr>
+            <w:tcW w:type="dxa" w:w="0"/>
+          </w:tcPr>
+          <w:p>
+            <w:r>
+              <w:t>Ж = 200 &lt; Ca = 240</w:t>
+            </w:r>
+          </w:p>
+        </w:tc>
+        <w:tc>
+          <w:tcPr>
+            <w:tcW w:type="dxa" w:w="0"/>
+          </w:tcPr>
+          <w:p>
+            <w:r>
+              <w:t>24</w:t>
+            </w:r>
+          </w:p>
+        </w:tc>
+        <w:tc>
+          <w:tcPr>
+            <w:tcW w:type="dxa" w:w="0"/>
+          </w:tcPr>
+          <w:p>
+            <w:r>
+              <w:t>при перестановке столбцов 0,6·(240 − 200) = 24, значит, скорее всего, на доске перепутали Ж и Ca</w:t>
+            </w:r>
+          </w:p>
+        </w:tc>
+      </w:tr>
+    </w:tbl>
+    <w:p>
+      <w:r>
+        <w:t xml:space="preserve"> </w:t>
       </w:r>
     </w:p>
     <w:p>
-      <w:pPr>
-        <w:pStyle w:val="ListBullet"/>
-      </w:pPr>
       <w:r>
-        <w:t>Pm &gt; Pf у всех бригад, то есть есть небольшой избыток извести. Наибольший у бригады 2.</w:t>
+        <w:t xml:space="preserve"> </w:t>
       </w:r>
     </w:p>
     <w:p>
-      <w:pPr>
-        <w:pStyle w:val="ListBullet"/>
-      </w:pPr>
       <w:r>
-        <w:t>Возможные погрешности, которые могут спросить:</w:t>
+        <w:t xml:space="preserve"> </w:t>
       </w:r>
     </w:p>
     <w:p>
-      <w:pPr>
-        <w:pStyle w:val="ListBullet2"/>
-      </w:pPr>
       <w:r>
-        <w:t>у бригад 2–4 сумма Ca²⁺ + Mg²⁺ больше общей жёсткости: 172 &gt; 160, 239 &gt; 208, 264 &gt; 200. Причина — погрешность титрования или разные единицы;</w:t>
+        <w:t xml:space="preserve"> </w:t>
       </w:r>
     </w:p>
     <w:p>
-      <w:pPr>
-        <w:pStyle w:val="ListBullet2"/>
-      </w:pPr>
       <w:r>
-        <w:t>у бригады 1 одновременно высокий Ca²⁺ (600 мг/л) и карбонаты, хотя химически они плохо совместимы, потому что CaCO₃ выпадает в осадок.</w:t>
+        <w:t xml:space="preserve"> У бригады 1 высокий Ca²⁺ (600 мг/л), вероятно загрязнение гипсом или цементом. Обработка — кальцинированная сода. При этом кальций и карбонаты вместе долго не существуют (выпадает CaCO₃), так что это результат в момент отбора пробы.</w:t>
       </w:r>
     </w:p>
     <w:p>
-      <w:pPr>
-        <w:pStyle w:val="ListBullet"/>
-      </w:pPr>
       <w:r>
-        <w:t>Если какой-то показатель ваша бригада не измеряла, сказать это прямо и объяснить, как бы его определяли.</w:t>
+        <w:rPr>
+          <w:b/>
+        </w:rPr>
+        <w:t>Важно:</w:t>
+      </w:r>
+      <w:r>
+        <w:t xml:space="preserve"> отметь рамкой в таблице свои результаты, как требует методичка. То, что ваша бригада не измеряла, честно назови и объясни, как бы это определяли.</w:t>
       </w:r>
     </w:p>
     <w:p>
@@ -1311,7 +2082,7 @@
         <w:pStyle w:val="Heading2"/>
       </w:pPr>
       <w:r>
-        <w:t>5. Вопросы для самопроверки</w:t>
+        <w:t>5. Вопросы для защиты и короткие ответы</w:t>
       </w:r>
     </w:p>
     <w:p>
@@ -1319,7 +2090,13 @@
         <w:pStyle w:val="ListNumber"/>
       </w:pPr>
       <w:r>
-        <w:t>Принцип определения Cl⁻ и зачем его определяют.</w:t>
+        <w:rPr>
+          <w:b/>
+        </w:rPr>
+        <w:t>Принцип химического анализа?</w:t>
+      </w:r>
+      <w:r>
+        <w:t xml:space="preserve"> Титрование стандартным раствором по индикатору, n₁V₁ = n₂V₂.</w:t>
       </w:r>
     </w:p>
     <w:p>
@@ -1327,7 +2104,13 @@
         <w:pStyle w:val="ListNumber"/>
       </w:pPr>
       <w:r>
-        <w:t>Зачем отдельно измеряют Pf и Mf.</w:t>
+        <w:rPr>
+          <w:b/>
+        </w:rPr>
+        <w:t>Как определяют Cl⁻ и зачем?</w:t>
+      </w:r>
+      <w:r>
+        <w:t xml:space="preserve"> Метод Мора, см. раздел 2. Нужно знать про засоление и приток пластовых вод.</w:t>
       </w:r>
     </w:p>
     <w:p>
@@ -1335,7 +2118,13 @@
         <w:pStyle w:val="ListNumber"/>
       </w:pPr>
       <w:r>
-        <w:t>Что показывает щёлочность и зачем она буровикам.</w:t>
+        <w:rPr>
+          <w:b/>
+        </w:rPr>
+        <w:t>Зачем нейтрализуют фильтрат перед определением Cl⁻?</w:t>
+      </w:r>
+      <w:r>
+        <w:t xml:space="preserve"> В щелочной среде Ag⁺ осаждается в виде Ag₂O и искажает результат.</w:t>
       </w:r>
     </w:p>
     <w:p>
@@ -1343,7 +2132,13 @@
         <w:pStyle w:val="ListNumber"/>
       </w:pPr>
       <w:r>
-        <w:t>Чем Pf отличается от Pm и как считают избыток извести.</w:t>
+        <w:rPr>
+          <w:b/>
+        </w:rPr>
+        <w:t>Зачем отдельно Pf и Mf?</w:t>
+      </w:r>
+      <w:r>
+        <w:t xml:space="preserve"> Метилоранж даёт только общую щёлочность. Pf выделяет OH⁻ и CO₃²⁻ (выше pH 8,3), и по соотношению Pf и Mf определяют тип щёлочности.</w:t>
       </w:r>
     </w:p>
     <w:p>
@@ -1351,7 +2146,13 @@
         <w:pStyle w:val="ListNumber"/>
       </w:pPr>
       <w:r>
-        <w:t>Зачем перед титрованием хлоридов нейтрализовать фильтрат.</w:t>
+        <w:rPr>
+          <w:b/>
+        </w:rPr>
+        <w:t>Что показывает щёлочность и зачем она буровикам?</w:t>
+      </w:r>
+      <w:r>
+        <w:t xml:space="preserve"> Тип щёлочности показывает стабильность раствора и загрязнение карбонатами и бикарбонатами (CO₂, разложение реагентов). От неё зависят реология и водоотдача, по ней выбирают обработку известью или каустиком.</w:t>
       </w:r>
     </w:p>
     <w:p>
@@ -1359,7 +2160,13 @@
         <w:pStyle w:val="ListNumber"/>
       </w:pPr>
       <w:r>
-        <w:t>Как определяют жёсткость, Ca и Mg: индикаторы и pH.</w:t>
+        <w:rPr>
+          <w:b/>
+        </w:rPr>
+        <w:t>Чем Pf отличается от Pm?</w:t>
+      </w:r>
+      <w:r>
+        <w:t xml:space="preserve"> Pf меряют по фильтрату, Pm — по всему раствору вместе с нерастворённой известью. Содержание извести = 0,742·(Pm − Fw·Pf) кг/м³.</w:t>
       </w:r>
     </w:p>
     <w:p>
@@ -1367,7 +2174,13 @@
         <w:pStyle w:val="ListNumber"/>
       </w:pPr>
       <w:r>
-        <w:t>Откуда в раствор попадают Ca²⁺, Cl⁻, CO₃²⁻ и как с каждым бороться.</w:t>
+        <w:rPr>
+          <w:b/>
+        </w:rPr>
+        <w:t>Как определить жёсткость, Ca и Mg?</w:t>
+      </w:r>
+      <w:r>
+        <w:t xml:space="preserve"> Трилон Б: при pH 10 с эриохромом чёрным — общая жёсткость, при pH 12–13 с мурексидом — Ca. Mg = 0,6·(Ж − Ca).</w:t>
       </w:r>
     </w:p>
     <w:p>
@@ -1375,7 +2188,41 @@
         <w:pStyle w:val="ListNumber"/>
       </w:pPr>
       <w:r>
-        <w:t>Как определить Pf в тёмном фильтрате (титрование по pH-метру до 8,3).</w:t>
+        <w:rPr>
+          <w:b/>
+        </w:rPr>
+        <w:t>Почему 0,6?</w:t>
+      </w:r>
+      <w:r>
+        <w:t xml:space="preserve"> Отношение атомных масс Mg и Ca: 24,3/40.</w:t>
+      </w:r>
+    </w:p>
+    <w:p>
+      <w:pPr>
+        <w:pStyle w:val="ListNumber"/>
+      </w:pPr>
+      <w:r>
+        <w:rPr>
+          <w:b/>
+        </w:rPr>
+        <w:t>Что делать, если фильтрат тёмный?</w:t>
+      </w:r>
+      <w:r>
+        <w:t xml:space="preserve"> Титровать по pH-метру до 8,3 (Pf, Pm) или 4,3 (Mf).</w:t>
+      </w:r>
+    </w:p>
+    <w:p>
+      <w:pPr>
+        <w:pStyle w:val="ListNumber"/>
+      </w:pPr>
+      <w:r>
+        <w:rPr>
+          <w:b/>
+        </w:rPr>
+        <w:t>Как избавиться от HCO₃⁻, CO₃²⁻, Ca²⁺?</w:t>
+      </w:r>
+      <w:r>
+        <w:t xml:space="preserve"> HCO₃⁻ и CO₃²⁻ — известью или NaOH (реакции 1–5), Ca²⁺ — кальцинированной содой Na₂CO₃.</w:t>
       </w:r>
     </w:p>
     <w:sectPr>

</xml_diff>